<commit_message>
feat: mejoras interfaz UI, ajustes notificaciones, idioma, y configuracion de fuentes
</commit_message>
<xml_diff>
--- a/Documentacion/Informe-Proyecto/RestCycle-DescripcionProyecto-v1.0(19-08-25).docx
+++ b/Documentacion/Informe-Proyecto/RestCycle-DescripcionProyecto-v1.0(19-08-25).docx
@@ -2145,21 +2145,7 @@
         <w:rPr>
           <w:rFonts w:cs="Arial"/>
         </w:rPr>
-        <w:t xml:space="preserve"> en el uso continuo del teléfono, mostrando una notificación instantánea que le indique el tiempo que lleva usándolo. Ya cumplido el tiempo </w:t>
-      </w:r>
-      <w:proofErr w:type="spellStart"/>
-      <w:r>
-        <w:rPr>
-          <w:rFonts w:cs="Arial"/>
-        </w:rPr>
-        <w:t>limite</w:t>
-      </w:r>
-      <w:proofErr w:type="spellEnd"/>
-      <w:r>
-        <w:rPr>
-          <w:rFonts w:cs="Arial"/>
-        </w:rPr>
-        <w:t xml:space="preserve"> de uso</w:t>
+        <w:t xml:space="preserve"> en el uso continuo del teléfono, mostrando una notificación instantánea que le indique el tiempo que lleva usándolo. Ya cumplido el tiempo limite de uso</w:t>
       </w:r>
       <w:r>
         <w:rPr>
@@ -2189,21 +2175,7 @@
         <w:rPr>
           <w:rFonts w:cs="Arial"/>
         </w:rPr>
-        <w:t xml:space="preserve">las aplicaciones y se indicara la reactivación de las </w:t>
-      </w:r>
-      <w:proofErr w:type="gramStart"/>
-      <w:r>
-        <w:rPr>
-          <w:rFonts w:cs="Arial"/>
-        </w:rPr>
-        <w:t>apps</w:t>
-      </w:r>
-      <w:proofErr w:type="gramEnd"/>
-      <w:r>
-        <w:rPr>
-          <w:rFonts w:cs="Arial"/>
-        </w:rPr>
-        <w:t xml:space="preserve">. De esta forma los padres pueden minimizar el tiempo que sus hijos están utilizando el dispositivo.  </w:t>
+        <w:t xml:space="preserve">las aplicaciones y se indicara la reactivación de las apps. De esta forma los padres pueden minimizar el tiempo que sus hijos están utilizando el dispositivo.  </w:t>
       </w:r>
       <w:bookmarkStart w:id="8" w:name="_Toc174527939"/>
     </w:p>
@@ -2422,13 +2394,8 @@
       <w:pPr>
         <w:pStyle w:val="a7"/>
       </w:pPr>
-      <w:proofErr w:type="spellStart"/>
-      <w:r>
-        <w:t>Opcion</w:t>
-      </w:r>
-      <w:proofErr w:type="spellEnd"/>
-      <w:r>
-        <w:t xml:space="preserve"> para leer y aceptar términos y condiciones para registrarse. </w:t>
+      <w:r>
+        <w:t xml:space="preserve">Opcion para leer y aceptar términos y condiciones para registrarse. </w:t>
       </w:r>
     </w:p>
     <w:p>
@@ -2449,23 +2416,7 @@
         <w:pStyle w:val="a7"/>
       </w:pPr>
       <w:r>
-        <w:t xml:space="preserve">Ingreso de usuarios a la </w:t>
-      </w:r>
-      <w:proofErr w:type="spellStart"/>
-      <w:r>
-        <w:t>aplicacion</w:t>
-      </w:r>
-      <w:proofErr w:type="spellEnd"/>
-      <w:r>
-        <w:t xml:space="preserve"> con cuenta por medio de </w:t>
-      </w:r>
-      <w:proofErr w:type="gramStart"/>
-      <w:r>
-        <w:t>credenciales(</w:t>
-      </w:r>
-      <w:proofErr w:type="gramEnd"/>
-      <w:r>
-        <w:t>Correo y contraseña).</w:t>
+        <w:t>Ingreso de usuarios a la aplicacion con cuenta por medio de credenciales(Correo y contraseña).</w:t>
       </w:r>
     </w:p>
     <w:p>
@@ -2508,15 +2459,7 @@
         <w:pStyle w:val="a7"/>
       </w:pPr>
       <w:r>
-        <w:t xml:space="preserve">Elección de membresía </w:t>
-      </w:r>
-      <w:proofErr w:type="gramStart"/>
-      <w:r>
-        <w:t>gratuita</w:t>
-      </w:r>
-      <w:proofErr w:type="gramEnd"/>
-      <w:r>
-        <w:t xml:space="preserve"> pero con limitaciones o premium para acceso completo.</w:t>
+        <w:t>Elección de membresía gratuita pero con limitaciones o premium para acceso completo.</w:t>
       </w:r>
     </w:p>
     <w:p>
@@ -2537,36 +2480,7 @@
         <w:pStyle w:val="a7"/>
       </w:pPr>
       <w:r>
-        <w:t xml:space="preserve">Acceso a cualquiera de los dos </w:t>
-      </w:r>
-      <w:proofErr w:type="gramStart"/>
-      <w:r>
-        <w:t>modos(</w:t>
-      </w:r>
-      <w:proofErr w:type="spellStart"/>
-      <w:proofErr w:type="gramEnd"/>
-      <w:r>
-        <w:t>Habitos</w:t>
-      </w:r>
-      <w:proofErr w:type="spellEnd"/>
-      <w:r>
-        <w:t xml:space="preserve"> Saludables o Control Parental) de forma </w:t>
-      </w:r>
-      <w:proofErr w:type="spellStart"/>
-      <w:r>
-        <w:t>facil</w:t>
-      </w:r>
-      <w:proofErr w:type="spellEnd"/>
-      <w:r>
-        <w:t xml:space="preserve"> y </w:t>
-      </w:r>
-      <w:proofErr w:type="spellStart"/>
-      <w:r>
-        <w:t>intutiva</w:t>
-      </w:r>
-      <w:proofErr w:type="spellEnd"/>
-      <w:r>
-        <w:t>.</w:t>
+        <w:t>Acceso a cualquiera de los dos modos(Habitos Saludables o Control Parental) de forma facil y intutiva.</w:t>
       </w:r>
     </w:p>
     <w:p>
@@ -2607,13 +2521,8 @@
       <w:pPr>
         <w:pStyle w:val="a7"/>
       </w:pPr>
-      <w:proofErr w:type="spellStart"/>
-      <w:r>
-        <w:t>Vinculacion</w:t>
-      </w:r>
-      <w:proofErr w:type="spellEnd"/>
-      <w:r>
-        <w:t xml:space="preserve"> entre cuentas, donde la cuenta del padre/tutor queda gestionando la cuenta de un MENOR DE EDAD.</w:t>
+      <w:r>
+        <w:t>Vinculacion entre cuentas, donde la cuenta del padre/tutor queda gestionando la cuenta de un MENOR DE EDAD.</w:t>
       </w:r>
     </w:p>
     <w:p>
@@ -2656,15 +2565,7 @@
         <w:pStyle w:val="a7"/>
       </w:pPr>
       <w:r>
-        <w:t xml:space="preserve">Los usuarios pueden ver un informe de las estadísticas del uso de aplicaciones del usuario en su </w:t>
-      </w:r>
-      <w:proofErr w:type="gramStart"/>
-      <w:r>
-        <w:t>dispositivo(</w:t>
-      </w:r>
-      <w:proofErr w:type="gramEnd"/>
-      <w:r>
-        <w:t>Diario, Semanal o Mensual).</w:t>
+        <w:t>Los usuarios pueden ver un informe de las estadísticas del uso de aplicaciones del usuario en su dispositivo(Diario, Semanal o Mensual).</w:t>
       </w:r>
     </w:p>
     <w:p>
@@ -2706,15 +2607,7 @@
         <w:pStyle w:val="a7"/>
       </w:pPr>
       <w:r>
-        <w:t xml:space="preserve">El usuario </w:t>
-      </w:r>
-      <w:proofErr w:type="spellStart"/>
-      <w:r>
-        <w:t>PAdre</w:t>
-      </w:r>
-      <w:proofErr w:type="spellEnd"/>
-      <w:r>
-        <w:t>/Tutor; puede agregar, modificar y/o eliminar tareas, eventos o compromisos pendientes para el usuario menor de edad.</w:t>
+        <w:t>El usuario PAdre/Tutor; puede agregar, modificar y/o eliminar tareas, eventos o compromisos pendientes para el usuario menor de edad.</w:t>
       </w:r>
     </w:p>
     <w:p>
@@ -2905,15 +2798,7 @@
         <w:pStyle w:val="a7"/>
       </w:pPr>
       <w:r>
-        <w:t xml:space="preserve">El usuario podrá vincular la </w:t>
-      </w:r>
-      <w:proofErr w:type="gramStart"/>
-      <w:r>
-        <w:t>app</w:t>
-      </w:r>
-      <w:proofErr w:type="gramEnd"/>
-      <w:r>
-        <w:t xml:space="preserve"> con un calendario, para gestionarle las tareas y actividades que tiene pendiente el usuario enlazado. </w:t>
+        <w:t xml:space="preserve">El usuario podrá vincular la app con un calendario, para gestionarle las tareas y actividades que tiene pendiente el usuario enlazado. </w:t>
       </w:r>
     </w:p>
     <w:p>
@@ -3943,21 +3828,7 @@
         <w:rPr>
           <w:rFonts w:cs="Arial"/>
         </w:rPr>
-        <w:t xml:space="preserve">Rol Padre: Usuario principal para la </w:t>
-      </w:r>
-      <w:proofErr w:type="gramStart"/>
-      <w:r>
-        <w:rPr>
-          <w:rFonts w:cs="Arial"/>
-        </w:rPr>
-        <w:t>app</w:t>
-      </w:r>
-      <w:proofErr w:type="gramEnd"/>
-      <w:r>
-        <w:rPr>
-          <w:rFonts w:cs="Arial"/>
-        </w:rPr>
-        <w:t xml:space="preserve"> que podrá crear y gestionar el usuario para el hijo, y también podrá realizar las funciones del rol hábitos saludables</w:t>
+        <w:t>Rol Padre: Usuario principal para la app que podrá crear y gestionar el usuario para el hijo, y también podrá realizar las funciones del rol hábitos saludables</w:t>
       </w:r>
     </w:p>
     <w:p>
@@ -4264,7 +4135,7 @@
           <w:rFonts w:cs="Arial"/>
           <w:color w:val="000000"/>
         </w:rPr>
-        <w:t>Smartphone o tableta con:</w:t>
+        <w:t>Smartphone con:</w:t>
       </w:r>
     </w:p>
     <w:p>
@@ -4294,21 +4165,35 @@
           <w:rFonts w:cs="Arial"/>
           <w:color w:val="000000"/>
         </w:rPr>
-        <w:t>Memoria RAM (al menos 6 GB)</w:t>
-      </w:r>
-    </w:p>
-    <w:p>
-      <w:pPr>
-        <w:pStyle w:val="a7"/>
-        <w:rPr>
-          <w:rFonts w:cs="Arial"/>
-        </w:rPr>
-      </w:pPr>
+        <w:t xml:space="preserve">Memoria RAM (al menos </w:t>
+      </w:r>
       <w:r>
         <w:rPr>
           <w:rFonts w:cs="Arial"/>
           <w:color w:val="000000"/>
         </w:rPr>
+        <w:t>3</w:t>
+      </w:r>
+      <w:r>
+        <w:rPr>
+          <w:rFonts w:cs="Arial"/>
+          <w:color w:val="000000"/>
+        </w:rPr>
+        <w:t xml:space="preserve"> GB)</w:t>
+      </w:r>
+    </w:p>
+    <w:p>
+      <w:pPr>
+        <w:pStyle w:val="a7"/>
+        <w:rPr>
+          <w:rFonts w:cs="Arial"/>
+        </w:rPr>
+      </w:pPr>
+      <w:r>
+        <w:rPr>
+          <w:rFonts w:cs="Arial"/>
+          <w:color w:val="000000"/>
+        </w:rPr>
         <w:t>Almacenamiento interno (al menos 128 GB)</w:t>
       </w:r>
     </w:p>
@@ -4325,52 +4210,7 @@
           <w:color w:val="000000"/>
         </w:rPr>
         <w:lastRenderedPageBreak/>
-        <w:t>Conectividad Wi-Fi, Bluetooth y GPS</w:t>
-      </w:r>
-    </w:p>
-    <w:p>
-      <w:pPr>
-        <w:pStyle w:val="a7"/>
-        <w:rPr>
-          <w:rFonts w:cs="Arial"/>
-          <w:color w:val="000000"/>
-        </w:rPr>
-      </w:pPr>
-      <w:r>
-        <w:rPr>
-          <w:rFonts w:cs="Arial"/>
-          <w:color w:val="000000"/>
-        </w:rPr>
-        <w:t>S</w:t>
-      </w:r>
-      <w:r>
-        <w:rPr>
-          <w:rFonts w:cs="Arial"/>
-          <w:color w:val="000000"/>
-        </w:rPr>
-        <w:t>ensor de huella</w:t>
-      </w:r>
-    </w:p>
-    <w:p>
-      <w:pPr>
-        <w:pStyle w:val="a7"/>
-        <w:rPr>
-          <w:rFonts w:cs="Arial"/>
-        </w:rPr>
-      </w:pPr>
-      <w:r>
-        <w:rPr>
-          <w:rFonts w:cs="Arial"/>
-          <w:color w:val="000000"/>
-        </w:rPr>
-        <w:t>R</w:t>
-      </w:r>
-      <w:r>
-        <w:rPr>
-          <w:rFonts w:cs="Arial"/>
-          <w:color w:val="000000"/>
-        </w:rPr>
-        <w:t xml:space="preserve">econocimiento facial y patrones de bloqueo </w:t>
+        <w:t xml:space="preserve">Conectividad Wi-Fi, Bluetooth y GPS </w:t>
       </w:r>
     </w:p>
     <w:p>
@@ -4497,7 +4337,6 @@
           <w:rFonts w:cs="Arial"/>
           <w:noProof/>
         </w:rPr>
-        <w:lastRenderedPageBreak/>
         <w:drawing>
           <wp:inline distT="0" distB="0" distL="0" distR="0" wp14:anchorId="4267075C" wp14:editId="35737F83">
             <wp:extent cx="5510966" cy="3979333"/>
@@ -4566,6 +4405,7 @@
           <w:szCs w:val="22"/>
           <w:lang w:val="es-CO"/>
         </w:rPr>
+        <w:lastRenderedPageBreak/>
         <w:t xml:space="preserve"> </w:t>
       </w:r>
       <w:bookmarkStart w:id="24" w:name="_Toc206664697"/>
@@ -4645,160 +4485,124 @@
         <w:rPr>
           <w:rFonts w:cs="Arial"/>
         </w:rPr>
+        <w:t>N</w:t>
+      </w:r>
+      <w:r>
+        <w:rPr>
+          <w:rFonts w:cs="Arial"/>
+        </w:rPr>
+        <w:t>os ayuda a estar atentos de toda aquella noticia que nos beneficie de los bancos o la agenda general para estar al día de cualquier inquietud o compromiso que tenga</w:t>
+      </w:r>
+      <w:r>
+        <w:rPr>
+          <w:rFonts w:cs="Arial"/>
+        </w:rPr>
+        <w:t>.</w:t>
+      </w:r>
+    </w:p>
+    <w:p>
+      <w:pPr>
+        <w:pStyle w:val="a7"/>
+        <w:rPr>
+          <w:rFonts w:cs="Arial"/>
+        </w:rPr>
+      </w:pPr>
+    </w:p>
+    <w:p>
+      <w:pPr>
+        <w:pStyle w:val="a7"/>
+        <w:rPr>
+          <w:rFonts w:cs="Arial"/>
+        </w:rPr>
+      </w:pPr>
+      <w:r>
+        <w:rPr>
+          <w:rFonts w:cs="Arial"/>
+        </w:rPr>
+        <w:t>En conclusión, el proyecto tiene como objetivo promover el uso adecuado y saludable de las herramientas y tecnologías en la vida cotidiana, especialmente en niños y jóvenes, para fomentar un equilibrio entre el uso de la tecnología y el desarrollo de otras habilidades y actividades. Además, la aplicación busca mantener a los usuarios informados y actualizados sobre noticias importantes y recordatorios de compromisos, con el fin de mejorar la organización y el bienestar en general.</w:t>
+      </w:r>
+      <w:r>
+        <w:rPr>
+          <w:rFonts w:cs="Arial"/>
+        </w:rPr>
+        <w:br/>
+      </w:r>
+    </w:p>
+    <w:p>
+      <w:pPr>
+        <w:pStyle w:val="a7"/>
+        <w:rPr>
+          <w:rFonts w:cs="Arial"/>
+        </w:rPr>
+      </w:pPr>
+      <w:r>
+        <w:rPr>
+          <w:rFonts w:cs="Arial"/>
+        </w:rPr>
+        <w:t xml:space="preserve">-Los logros principales de este proyecto es concientizar y formar personas con </w:t>
+      </w:r>
+      <w:r>
+        <w:rPr>
+          <w:rFonts w:cs="Arial"/>
+        </w:rPr>
+        <w:t>más</w:t>
+      </w:r>
+      <w:r>
+        <w:rPr>
+          <w:rFonts w:cs="Arial"/>
+        </w:rPr>
+        <w:t xml:space="preserve"> </w:t>
+      </w:r>
+      <w:r>
+        <w:rPr>
+          <w:rFonts w:cs="Arial"/>
+        </w:rPr>
+        <w:t>hábitos</w:t>
+      </w:r>
+      <w:r>
+        <w:rPr>
+          <w:rFonts w:cs="Arial"/>
+        </w:rPr>
+        <w:t xml:space="preserve"> saludables </w:t>
+      </w:r>
+      <w:r>
+        <w:rPr>
+          <w:rFonts w:cs="Arial"/>
+        </w:rPr>
+        <w:t>al momento</w:t>
+      </w:r>
+      <w:r>
+        <w:rPr>
+          <w:rFonts w:cs="Arial"/>
+        </w:rPr>
+        <w:t xml:space="preserve"> de usar las herramientas</w:t>
+      </w:r>
+      <w:r>
+        <w:rPr>
+          <w:rFonts w:cs="Arial"/>
+        </w:rPr>
+        <w:t>.</w:t>
+      </w:r>
+    </w:p>
+    <w:p>
+      <w:pPr>
+        <w:pStyle w:val="a7"/>
+        <w:rPr>
+          <w:rFonts w:cs="Arial"/>
+        </w:rPr>
+      </w:pPr>
+      <w:r>
+        <w:rPr>
+          <w:rFonts w:cs="Arial"/>
+        </w:rPr>
+        <w:t xml:space="preserve">en un futuro esta aplicación creara vínculos de compras y monetización permitiendo sacar remuneraciones para la actualización de esta y la implementación de nuevas tecnologías y diseños que nos permitan llegar a mas personas hasta lograr el </w:t>
+      </w:r>
+      <w:r>
+        <w:rPr>
+          <w:rFonts w:cs="Arial"/>
+        </w:rPr>
         <w:lastRenderedPageBreak/>
-        <w:t>N</w:t>
-      </w:r>
-      <w:r>
-        <w:rPr>
-          <w:rFonts w:cs="Arial"/>
-        </w:rPr>
-        <w:t xml:space="preserve">os ayuda a estar atentos </w:t>
-      </w:r>
-      <w:proofErr w:type="gramStart"/>
-      <w:r>
-        <w:rPr>
-          <w:rFonts w:cs="Arial"/>
-        </w:rPr>
-        <w:t>de</w:t>
-      </w:r>
-      <w:proofErr w:type="gramEnd"/>
-      <w:r>
-        <w:rPr>
-          <w:rFonts w:cs="Arial"/>
-        </w:rPr>
-        <w:t xml:space="preserve"> toda aquella noticia que nos beneficie de los bancos o la agenda general para estar al día de cualquier inquietud o compromiso que tenga</w:t>
-      </w:r>
-      <w:r>
-        <w:rPr>
-          <w:rFonts w:cs="Arial"/>
-        </w:rPr>
-        <w:t>.</w:t>
-      </w:r>
-    </w:p>
-    <w:p>
-      <w:pPr>
-        <w:pStyle w:val="a7"/>
-        <w:rPr>
-          <w:rFonts w:cs="Arial"/>
-        </w:rPr>
-      </w:pPr>
-    </w:p>
-    <w:p>
-      <w:pPr>
-        <w:pStyle w:val="a7"/>
-        <w:rPr>
-          <w:rFonts w:cs="Arial"/>
-        </w:rPr>
-      </w:pPr>
-      <w:r>
-        <w:rPr>
-          <w:rFonts w:cs="Arial"/>
-        </w:rPr>
-        <w:t>En conclusión, el proyecto tiene como objetivo promover el uso adecuado y saludable de las herramientas y tecnologías en la vida cotidiana, especialmente en niños y jóvenes, para fomentar un equilibrio entre el uso de la tecnología y el desarrollo de otras habilidades y actividades. Además, la aplicación busca mantener a los usuarios informados y actualizados sobre noticias importantes y recordatorios de compromisos, con el fin de mejorar la organización y el bienestar en general.</w:t>
-      </w:r>
-      <w:r>
-        <w:rPr>
-          <w:rFonts w:cs="Arial"/>
-        </w:rPr>
-        <w:br/>
-      </w:r>
-    </w:p>
-    <w:p>
-      <w:pPr>
-        <w:pStyle w:val="a7"/>
-        <w:rPr>
-          <w:rFonts w:cs="Arial"/>
-        </w:rPr>
-      </w:pPr>
-      <w:r>
-        <w:rPr>
-          <w:rFonts w:cs="Arial"/>
-        </w:rPr>
-        <w:t xml:space="preserve">-Los logros principales de este proyecto es concientizar y formar personas con </w:t>
-      </w:r>
-      <w:r>
-        <w:rPr>
-          <w:rFonts w:cs="Arial"/>
-        </w:rPr>
-        <w:t>más</w:t>
-      </w:r>
-      <w:r>
-        <w:rPr>
-          <w:rFonts w:cs="Arial"/>
-        </w:rPr>
-        <w:t xml:space="preserve"> </w:t>
-      </w:r>
-      <w:r>
-        <w:rPr>
-          <w:rFonts w:cs="Arial"/>
-        </w:rPr>
-        <w:t>hábitos</w:t>
-      </w:r>
-      <w:r>
-        <w:rPr>
-          <w:rFonts w:cs="Arial"/>
-        </w:rPr>
-        <w:t xml:space="preserve"> saludables </w:t>
-      </w:r>
-      <w:r>
-        <w:rPr>
-          <w:rFonts w:cs="Arial"/>
-        </w:rPr>
-        <w:t>al momento</w:t>
-      </w:r>
-      <w:r>
-        <w:rPr>
-          <w:rFonts w:cs="Arial"/>
-        </w:rPr>
-        <w:t xml:space="preserve"> de usar las herramientas</w:t>
-      </w:r>
-      <w:r>
-        <w:rPr>
-          <w:rFonts w:cs="Arial"/>
-        </w:rPr>
-        <w:t>.</w:t>
-      </w:r>
-    </w:p>
-    <w:p>
-      <w:pPr>
-        <w:pStyle w:val="a7"/>
-        <w:rPr>
-          <w:rFonts w:cs="Arial"/>
-        </w:rPr>
-      </w:pPr>
-      <w:r>
-        <w:rPr>
-          <w:rFonts w:cs="Arial"/>
-        </w:rPr>
-        <w:t xml:space="preserve">en un futuro esta aplicación creara vínculos de compras y monetización permitiendo sacar remuneraciones para la actualización de esta y la implementación de nuevas tecnologías y diseños que nos permitan llegar a </w:t>
-      </w:r>
-      <w:proofErr w:type="spellStart"/>
-      <w:r>
-        <w:rPr>
-          <w:rFonts w:cs="Arial"/>
-        </w:rPr>
-        <w:t>mas</w:t>
-      </w:r>
-      <w:proofErr w:type="spellEnd"/>
-      <w:r>
-        <w:rPr>
-          <w:rFonts w:cs="Arial"/>
-        </w:rPr>
-        <w:t xml:space="preserve"> personas hasta lograr el objetivo de volverla una </w:t>
-      </w:r>
-      <w:proofErr w:type="gramStart"/>
-      <w:r>
-        <w:rPr>
-          <w:rFonts w:cs="Arial"/>
-        </w:rPr>
-        <w:t>app</w:t>
-      </w:r>
-      <w:proofErr w:type="gramEnd"/>
-      <w:r>
-        <w:rPr>
-          <w:rFonts w:cs="Arial"/>
-        </w:rPr>
-        <w:t xml:space="preserve"> primaria que venga integrada en todos los dispositivos inteligentes para mejorar y fomentar desarrollo de hábitos saludables en las personas.</w:t>
+        <w:t>objetivo de volverla una app primaria que venga integrada en todos los dispositivos inteligentes para mejorar y fomentar desarrollo de hábitos saludables en las personas.</w:t>
       </w:r>
       <w:bookmarkStart w:id="25" w:name="_Toc174527949"/>
     </w:p>
@@ -4829,7 +4633,6 @@
           <w:szCs w:val="22"/>
           <w:lang w:val="es-CO"/>
         </w:rPr>
-        <w:lastRenderedPageBreak/>
         <w:t>RESUMEN</w:t>
       </w:r>
       <w:bookmarkEnd w:id="26"/>
@@ -7622,7 +7425,7 @@
       <w:szCs w:val="18"/>
     </w:rPr>
   </w:style>
-  <w:style w:type="character" w:styleId="Textoennegrita">
+  <w:style w:type="character" w:styleId="Fuerte">
     <w:name w:val="Strong"/>
     <w:basedOn w:val="Fuentedeprrafopredeter"/>
     <w:uiPriority w:val="22"/>

</xml_diff>